<commit_message>
ChatGPT-style chat (typewriter reveal, Auto toggle, options drawer), Learn lab UI, learning guide, docs and tests
Co-Authored-By: Claude Sonnet 5.5 <noreply@anthropic.com>
Claude-Session: https://claude.ai/code/session_012muWped4tVffJ87y3fEXZK
</commit_message>
<xml_diff>
--- a/docs/eval/eval_report.docx
+++ b/docs/eval/eval_report.docx
@@ -17,7 +17,7 @@
     </w:p>
     <w:p>
       <w:r>
-        <w:t>Generated 2026-10-30 07:50:40 UTC</w:t>
+        <w:t>Generated 2026-10-31 14:59:45 UTC</w:t>
       </w:r>
     </w:p>
     <w:p>
@@ -248,7 +248,7 @@
           </w:tcPr>
           <w:p>
             <w:r>
-              <w:t>18 / 28 ms</w:t>
+              <w:t>30 / 43 ms</w:t>
             </w:r>
           </w:p>
         </w:tc>
@@ -1275,7 +1275,7 @@
           </w:tcPr>
           <w:p>
             <w:r>
-              <w:t>15.3</w:t>
+              <w:t>26.4</w:t>
             </w:r>
           </w:p>
         </w:tc>
@@ -1347,7 +1347,7 @@
           </w:tcPr>
           <w:p>
             <w:r>
-              <w:t>20.5</w:t>
+              <w:t>27.4</w:t>
             </w:r>
           </w:p>
         </w:tc>
@@ -1419,7 +1419,7 @@
           </w:tcPr>
           <w:p>
             <w:r>
-              <w:t>15.8</w:t>
+              <w:t>19.9</w:t>
             </w:r>
           </w:p>
         </w:tc>
@@ -1491,7 +1491,7 @@
           </w:tcPr>
           <w:p>
             <w:r>
-              <w:t>14.8</w:t>
+              <w:t>33.9</w:t>
             </w:r>
           </w:p>
         </w:tc>
@@ -1563,7 +1563,7 @@
           </w:tcPr>
           <w:p>
             <w:r>
-              <w:t>18.7</w:t>
+              <w:t>30.4</w:t>
             </w:r>
           </w:p>
         </w:tc>
@@ -1768,7 +1768,7 @@
           </w:tcPr>
           <w:p>
             <w:r>
-              <w:t>16.0</w:t>
+              <w:t>25.5</w:t>
             </w:r>
           </w:p>
         </w:tc>
@@ -1778,7 +1778,7 @@
           </w:tcPr>
           <w:p>
             <w:r>
-              <w:t>24.9</w:t>
+              <w:t>43.3</w:t>
             </w:r>
           </w:p>
         </w:tc>
@@ -1850,7 +1850,7 @@
           </w:tcPr>
           <w:p>
             <w:r>
-              <w:t>14.8</w:t>
+              <w:t>24.1</w:t>
             </w:r>
           </w:p>
         </w:tc>
@@ -1860,7 +1860,7 @@
           </w:tcPr>
           <w:p>
             <w:r>
-              <w:t>21.4</w:t>
+              <w:t>31.7</w:t>
             </w:r>
           </w:p>
         </w:tc>
@@ -1932,7 +1932,7 @@
           </w:tcPr>
           <w:p>
             <w:r>
-              <w:t>16.5</w:t>
+              <w:t>22.2</w:t>
             </w:r>
           </w:p>
         </w:tc>
@@ -1942,7 +1942,7 @@
           </w:tcPr>
           <w:p>
             <w:r>
-              <w:t>22.9</w:t>
+              <w:t>37.8</w:t>
             </w:r>
           </w:p>
         </w:tc>
@@ -2014,7 +2014,7 @@
           </w:tcPr>
           <w:p>
             <w:r>
-              <w:t>16.3</w:t>
+              <w:t>26.9</w:t>
             </w:r>
           </w:p>
         </w:tc>
@@ -2024,7 +2024,7 @@
           </w:tcPr>
           <w:p>
             <w:r>
-              <w:t>24.8</w:t>
+              <w:t>37.1</w:t>
             </w:r>
           </w:p>
         </w:tc>
@@ -2096,7 +2096,7 @@
           </w:tcPr>
           <w:p>
             <w:r>
-              <w:t>16.1</w:t>
+              <w:t>24.8</w:t>
             </w:r>
           </w:p>
         </w:tc>
@@ -2106,7 +2106,7 @@
           </w:tcPr>
           <w:p>
             <w:r>
-              <w:t>22.7</w:t>
+              <w:t>42.2</w:t>
             </w:r>
           </w:p>
         </w:tc>
@@ -2178,7 +2178,7 @@
           </w:tcPr>
           <w:p>
             <w:r>
-              <w:t>17.8</w:t>
+              <w:t>27.6</w:t>
             </w:r>
           </w:p>
         </w:tc>
@@ -2188,7 +2188,7 @@
           </w:tcPr>
           <w:p>
             <w:r>
-              <w:t>24.7</w:t>
+              <w:t>40.9</w:t>
             </w:r>
           </w:p>
         </w:tc>
@@ -2540,7 +2540,7 @@
           </w:tcPr>
           <w:p>
             <w:r>
-              <w:t>43</w:t>
+              <w:t>79</w:t>
             </w:r>
           </w:p>
         </w:tc>
@@ -2612,7 +2612,7 @@
           </w:tcPr>
           <w:p>
             <w:r>
-              <w:t>19</w:t>
+              <w:t>39</w:t>
             </w:r>
           </w:p>
         </w:tc>
@@ -2684,7 +2684,7 @@
           </w:tcPr>
           <w:p>
             <w:r>
-              <w:t>14</w:t>
+              <w:t>33</w:t>
             </w:r>
           </w:p>
         </w:tc>
@@ -2756,7 +2756,7 @@
           </w:tcPr>
           <w:p>
             <w:r>
-              <w:t>20</w:t>
+              <w:t>44</w:t>
             </w:r>
           </w:p>
         </w:tc>
@@ -2828,7 +2828,7 @@
           </w:tcPr>
           <w:p>
             <w:r>
-              <w:t>20</w:t>
+              <w:t>40</w:t>
             </w:r>
           </w:p>
         </w:tc>
@@ -2900,7 +2900,7 @@
           </w:tcPr>
           <w:p>
             <w:r>
-              <w:t>14</w:t>
+              <w:t>27</w:t>
             </w:r>
           </w:p>
         </w:tc>
@@ -2972,7 +2972,7 @@
           </w:tcPr>
           <w:p>
             <w:r>
-              <w:t>13</w:t>
+              <w:t>22</w:t>
             </w:r>
           </w:p>
         </w:tc>
@@ -3044,7 +3044,7 @@
           </w:tcPr>
           <w:p>
             <w:r>
-              <w:t>19</w:t>
+              <w:t>28</w:t>
             </w:r>
           </w:p>
         </w:tc>
@@ -3116,7 +3116,7 @@
           </w:tcPr>
           <w:p>
             <w:r>
-              <w:t>16</w:t>
+              <w:t>30</w:t>
             </w:r>
           </w:p>
         </w:tc>
@@ -3188,7 +3188,7 @@
           </w:tcPr>
           <w:p>
             <w:r>
-              <w:t>14</w:t>
+              <w:t>27</w:t>
             </w:r>
           </w:p>
         </w:tc>
@@ -3260,7 +3260,7 @@
           </w:tcPr>
           <w:p>
             <w:r>
-              <w:t>26</w:t>
+              <w:t>49</w:t>
             </w:r>
           </w:p>
         </w:tc>
@@ -3332,7 +3332,7 @@
           </w:tcPr>
           <w:p>
             <w:r>
-              <w:t>13</w:t>
+              <w:t>32</w:t>
             </w:r>
           </w:p>
         </w:tc>
@@ -3404,7 +3404,7 @@
           </w:tcPr>
           <w:p>
             <w:r>
-              <w:t>22</w:t>
+              <w:t>40</w:t>
             </w:r>
           </w:p>
         </w:tc>
@@ -3476,7 +3476,7 @@
           </w:tcPr>
           <w:p>
             <w:r>
-              <w:t>17</w:t>
+              <w:t>31</w:t>
             </w:r>
           </w:p>
         </w:tc>
@@ -3548,7 +3548,7 @@
           </w:tcPr>
           <w:p>
             <w:r>
-              <w:t>16</w:t>
+              <w:t>26</w:t>
             </w:r>
           </w:p>
         </w:tc>
@@ -3620,7 +3620,7 @@
           </w:tcPr>
           <w:p>
             <w:r>
-              <w:t>16</w:t>
+              <w:t>30</w:t>
             </w:r>
           </w:p>
         </w:tc>
@@ -3692,7 +3692,7 @@
           </w:tcPr>
           <w:p>
             <w:r>
-              <w:t>19</w:t>
+              <w:t>38</w:t>
             </w:r>
           </w:p>
         </w:tc>
@@ -3764,7 +3764,7 @@
           </w:tcPr>
           <w:p>
             <w:r>
-              <w:t>16</w:t>
+              <w:t>30</w:t>
             </w:r>
           </w:p>
         </w:tc>
@@ -3836,7 +3836,7 @@
           </w:tcPr>
           <w:p>
             <w:r>
-              <w:t>25</w:t>
+              <w:t>30</w:t>
             </w:r>
           </w:p>
         </w:tc>
@@ -3908,7 +3908,7 @@
           </w:tcPr>
           <w:p>
             <w:r>
-              <w:t>20</w:t>
+              <w:t>18</w:t>
             </w:r>
           </w:p>
         </w:tc>
@@ -3980,7 +3980,7 @@
           </w:tcPr>
           <w:p>
             <w:r>
-              <w:t>28</w:t>
+              <w:t>30</w:t>
             </w:r>
           </w:p>
         </w:tc>
@@ -4052,7 +4052,7 @@
           </w:tcPr>
           <w:p>
             <w:r>
-              <w:t>18</w:t>
+              <w:t>20</w:t>
             </w:r>
           </w:p>
         </w:tc>
@@ -4124,7 +4124,7 @@
           </w:tcPr>
           <w:p>
             <w:r>
-              <w:t>15</w:t>
+              <w:t>17</w:t>
             </w:r>
           </w:p>
         </w:tc>
@@ -4196,7 +4196,7 @@
           </w:tcPr>
           <w:p>
             <w:r>
-              <w:t>21</w:t>
+              <w:t>17</w:t>
             </w:r>
           </w:p>
         </w:tc>
@@ -4268,7 +4268,7 @@
           </w:tcPr>
           <w:p>
             <w:r>
-              <w:t>10</w:t>
+              <w:t>34</w:t>
             </w:r>
           </w:p>
         </w:tc>
@@ -4340,7 +4340,7 @@
           </w:tcPr>
           <w:p>
             <w:r>
-              <w:t>17</w:t>
+              <w:t>35</w:t>
             </w:r>
           </w:p>
         </w:tc>
@@ -4412,7 +4412,7 @@
           </w:tcPr>
           <w:p>
             <w:r>
-              <w:t>14</w:t>
+              <w:t>20</w:t>
             </w:r>
           </w:p>
         </w:tc>
@@ -4484,7 +4484,7 @@
           </w:tcPr>
           <w:p>
             <w:r>
-              <w:t>28</w:t>
+              <w:t>30</w:t>
             </w:r>
           </w:p>
         </w:tc>
@@ -4556,7 +4556,7 @@
           </w:tcPr>
           <w:p>
             <w:r>
-              <w:t>17</w:t>
+              <w:t>25</w:t>
             </w:r>
           </w:p>
         </w:tc>
@@ -4628,7 +4628,7 @@
           </w:tcPr>
           <w:p>
             <w:r>
-              <w:t>20</w:t>
+              <w:t>26</w:t>
             </w:r>
           </w:p>
         </w:tc>
@@ -4700,7 +4700,7 @@
           </w:tcPr>
           <w:p>
             <w:r>
-              <w:t>18</w:t>
+              <w:t>28</w:t>
             </w:r>
           </w:p>
         </w:tc>
@@ -4772,7 +4772,7 @@
           </w:tcPr>
           <w:p>
             <w:r>
-              <w:t>19</w:t>
+              <w:t>27</w:t>
             </w:r>
           </w:p>
         </w:tc>
@@ -4844,7 +4844,7 @@
           </w:tcPr>
           <w:p>
             <w:r>
-              <w:t>21</w:t>
+              <w:t>25</w:t>
             </w:r>
           </w:p>
         </w:tc>
@@ -4916,7 +4916,7 @@
           </w:tcPr>
           <w:p>
             <w:r>
-              <w:t>23</w:t>
+              <w:t>29</w:t>
             </w:r>
           </w:p>
         </w:tc>
@@ -4988,7 +4988,7 @@
           </w:tcPr>
           <w:p>
             <w:r>
-              <w:t>21</w:t>
+              <w:t>29</w:t>
             </w:r>
           </w:p>
         </w:tc>
@@ -5060,7 +5060,7 @@
           </w:tcPr>
           <w:p>
             <w:r>
-              <w:t>18</w:t>
+              <w:t>27</w:t>
             </w:r>
           </w:p>
         </w:tc>
@@ -5132,7 +5132,7 @@
           </w:tcPr>
           <w:p>
             <w:r>
-              <w:t>16</w:t>
+              <w:t>22</w:t>
             </w:r>
           </w:p>
         </w:tc>
@@ -5204,7 +5204,7 @@
           </w:tcPr>
           <w:p>
             <w:r>
-              <w:t>18</w:t>
+              <w:t>38</w:t>
             </w:r>
           </w:p>
         </w:tc>
@@ -5276,7 +5276,7 @@
           </w:tcPr>
           <w:p>
             <w:r>
-              <w:t>14</w:t>
+              <w:t>31</w:t>
             </w:r>
           </w:p>
         </w:tc>
@@ -5348,7 +5348,7 @@
           </w:tcPr>
           <w:p>
             <w:r>
-              <w:t>13</w:t>
+              <w:t>20</w:t>
             </w:r>
           </w:p>
         </w:tc>
@@ -5420,7 +5420,7 @@
           </w:tcPr>
           <w:p>
             <w:r>
-              <w:t>17</w:t>
+              <w:t>38</w:t>
             </w:r>
           </w:p>
         </w:tc>
@@ -5492,7 +5492,7 @@
           </w:tcPr>
           <w:p>
             <w:r>
-              <w:t>12</w:t>
+              <w:t>30</w:t>
             </w:r>
           </w:p>
         </w:tc>
@@ -5642,7 +5642,7 @@
           </w:tcPr>
           <w:p>
             <w:r>
-              <w:t>2026-10-30T07:50:39+00:00</w:t>
+              <w:t>2026-10-31T14:59:43+00:00</w:t>
             </w:r>
           </w:p>
         </w:tc>
@@ -5652,7 +5652,7 @@
           </w:tcPr>
           <w:p>
             <w:r>
-              <w:t>08342e63af66</w:t>
+              <w:t>ba9b0b05a100</w:t>
             </w:r>
           </w:p>
         </w:tc>
@@ -5694,7 +5694,7 @@
           </w:tcPr>
           <w:p>
             <w:r>
-              <w:t>2026-10-30T07:50:39+00:00</w:t>
+              <w:t>2026-10-31T14:59:43+00:00</w:t>
             </w:r>
           </w:p>
         </w:tc>
@@ -5704,7 +5704,7 @@
           </w:tcPr>
           <w:p>
             <w:r>
-              <w:t>b3a6c24070a1</w:t>
+              <w:t>dabd44ecf45e</w:t>
             </w:r>
           </w:p>
         </w:tc>
@@ -5746,7 +5746,7 @@
           </w:tcPr>
           <w:p>
             <w:r>
-              <w:t>2026-10-30T07:50:39+00:00</w:t>
+              <w:t>2026-10-31T14:59:43+00:00</w:t>
             </w:r>
           </w:p>
         </w:tc>
@@ -5756,7 +5756,7 @@
           </w:tcPr>
           <w:p>
             <w:r>
-              <w:t>3dc9560fa396</w:t>
+              <w:t>4c5876822788</w:t>
             </w:r>
           </w:p>
         </w:tc>
@@ -5798,7 +5798,7 @@
           </w:tcPr>
           <w:p>
             <w:r>
-              <w:t>2026-10-30T07:50:39+00:00</w:t>
+              <w:t>2026-10-31T14:59:43+00:00</w:t>
             </w:r>
           </w:p>
         </w:tc>
@@ -5808,7 +5808,7 @@
           </w:tcPr>
           <w:p>
             <w:r>
-              <w:t>793a140afb7e</w:t>
+              <w:t>a3456d50fc4a</w:t>
             </w:r>
           </w:p>
         </w:tc>
@@ -5850,7 +5850,7 @@
           </w:tcPr>
           <w:p>
             <w:r>
-              <w:t>2026-10-30T07:50:39+00:00</w:t>
+              <w:t>2026-10-31T14:59:43+00:00</w:t>
             </w:r>
           </w:p>
         </w:tc>
@@ -5902,7 +5902,7 @@
           </w:tcPr>
           <w:p>
             <w:r>
-              <w:t>2026-10-30T07:50:39+00:00</w:t>
+              <w:t>2026-10-31T14:59:43+00:00</w:t>
             </w:r>
           </w:p>
         </w:tc>
@@ -5954,7 +5954,7 @@
           </w:tcPr>
           <w:p>
             <w:r>
-              <w:t>2026-10-30T07:50:39+00:00</w:t>
+              <w:t>2026-10-31T14:59:43+00:00</w:t>
             </w:r>
           </w:p>
         </w:tc>
@@ -6006,7 +6006,7 @@
           </w:tcPr>
           <w:p>
             <w:r>
-              <w:t>2026-10-30T07:50:39+00:00</w:t>
+              <w:t>2026-10-31T14:59:43+00:00</w:t>
             </w:r>
           </w:p>
         </w:tc>

</xml_diff>